<commit_message>
add some data standard files
</commit_message>
<xml_diff>
--- a/dama/cases/水投集团数据分类分级/1-营收系统/营收系统数据分类分级标准.docx
+++ b/dama/cases/水投集团数据分类分级/1-营收系统/营收系统数据分类分级标准.docx
@@ -3148,6 +3148,12 @@
             <w:insideH w:val="single" w:color="auto" w:sz="4" w:space="0"/>
             <w:insideV w:val="single" w:color="auto" w:sz="4" w:space="0"/>
           </w:tblBorders>
+          <w:tblCellMar>
+            <w:top w:w="0" w:type="dxa"/>
+            <w:left w:w="108" w:type="dxa"/>
+            <w:bottom w:w="0" w:type="dxa"/>
+            <w:right w:w="108" w:type="dxa"/>
+          </w:tblCellMar>
         </w:tblPrEx>
         <w:trPr>
           <w:trHeight w:val="567" w:hRule="atLeast"/>
@@ -3373,8 +3379,6 @@
         </w:rPr>
         <w:t>信息</w:t>
       </w:r>
-      <w:bookmarkStart w:id="26" w:name="_GoBack"/>
-      <w:bookmarkEnd w:id="26"/>
     </w:p>
     <w:tbl>
       <w:tblPr>
@@ -4149,7 +4153,23 @@
                 <w:kern w:val="0"/>
                 <w:szCs w:val="20"/>
               </w:rPr>
-              <w:t>混合用水配置表</w:t>
+              <w:t>混合用水</w:t>
+            </w:r>
+            <w:r>
+              <w:rPr>
+                <w:rFonts w:hint="eastAsia"/>
+                <w:kern w:val="0"/>
+                <w:szCs w:val="20"/>
+                <w:lang w:val="en-US" w:eastAsia="zh-CN"/>
+              </w:rPr>
+              <w:t>方案</w:t>
+            </w:r>
+            <w:r>
+              <w:rPr>
+                <w:kern w:val="0"/>
+                <w:szCs w:val="20"/>
+              </w:rPr>
+              <w:t>配置表</w:t>
             </w:r>
           </w:p>
         </w:tc>
@@ -4827,6 +4847,8 @@
               </w:rPr>
               <w:t>CMS_BILLING_MONTH</w:t>
             </w:r>
+            <w:bookmarkStart w:id="26" w:name="_GoBack"/>
+            <w:bookmarkEnd w:id="26"/>
           </w:p>
         </w:tc>
         <w:tc>
@@ -5414,12 +5436,6 @@
             <w:insideH w:val="single" w:color="auto" w:sz="4" w:space="0"/>
             <w:insideV w:val="single" w:color="auto" w:sz="4" w:space="0"/>
           </w:tblBorders>
-          <w:tblCellMar>
-            <w:top w:w="0" w:type="dxa"/>
-            <w:left w:w="108" w:type="dxa"/>
-            <w:bottom w:w="0" w:type="dxa"/>
-            <w:right w:w="108" w:type="dxa"/>
-          </w:tblCellMar>
         </w:tblPrEx>
         <w:trPr>
           <w:trHeight w:val="567" w:hRule="atLeast"/>
@@ -12649,6 +12665,12 @@
             <w:insideH w:val="single" w:color="auto" w:sz="4" w:space="0"/>
             <w:insideV w:val="single" w:color="auto" w:sz="4" w:space="0"/>
           </w:tblBorders>
+          <w:tblCellMar>
+            <w:top w:w="0" w:type="dxa"/>
+            <w:left w:w="108" w:type="dxa"/>
+            <w:bottom w:w="0" w:type="dxa"/>
+            <w:right w:w="108" w:type="dxa"/>
+          </w:tblCellMar>
         </w:tblPrEx>
         <w:trPr>
           <w:trHeight w:val="567" w:hRule="atLeast"/>
@@ -14872,6 +14894,12 @@
             <w:insideH w:val="single" w:color="auto" w:sz="4" w:space="0"/>
             <w:insideV w:val="single" w:color="auto" w:sz="4" w:space="0"/>
           </w:tblBorders>
+          <w:tblCellMar>
+            <w:top w:w="0" w:type="dxa"/>
+            <w:left w:w="108" w:type="dxa"/>
+            <w:bottom w:w="0" w:type="dxa"/>
+            <w:right w:w="108" w:type="dxa"/>
+          </w:tblCellMar>
         </w:tblPrEx>
         <w:trPr>
           <w:trHeight w:val="567" w:hRule="atLeast"/>

</xml_diff>